<commit_message>
docs: precision sur les acteurs du ticketing + dossier regenere
- Qui utilise Jira (client/prestataire, pas le grand public) + parcours d'un incident
</commit_message>
<xml_diff>
--- a/calm-space/docs/DOSSIER_BLOC3.docx
+++ b/calm-space/docs/DOSSIER_BLOC3.docx
@@ -4809,6 +4809,616 @@
       <w:r>
         <w:t xml:space="preserve"> suivi de sa création jusqu'à sa résolution et sa validation.</w:t>
       </w:r>
+    </w:p>
+    <w:p>
+      <w:pPr>
+        <w:pStyle w:val="Heading3"/>
+      </w:pPr>
+      <w:r>
+        <w:t xml:space="preserve">Qui utilise l'outil, et comment ?</w:t>
+      </w:r>
+    </w:p>
+    <w:p>
+      <w:r>
+        <w:t xml:space="preserve">Le ticketing est un outil </w:t>
+      </w:r>
+      <w:r>
+        <w:rPr>
+          <w:b/>
+          <w:bCs/>
+        </w:rPr>
+        <w:t xml:space="preserve">interne de gestion</w:t>
+      </w:r>
+      <w:r>
+        <w:t xml:space="preserve">, partagé </w:t>
+      </w:r>
+      <w:r>
+        <w:rPr>
+          <w:b/>
+          <w:bCs/>
+        </w:rPr>
+        <w:t xml:space="preserve">entre le client et le prestataire</w:t>
+      </w:r>
+      <w:r>
+        <w:t xml:space="preserve">. Ce n'est </w:t>
+      </w:r>
+      <w:r>
+        <w:rPr>
+          <w:b/>
+          <w:bCs/>
+        </w:rPr>
+        <w:t xml:space="preserve">pas</w:t>
+      </w:r>
+      <w:r>
+        <w:t xml:space="preserve"> un outil destiné au grand public.</w:t>
+      </w:r>
+    </w:p>
+    <w:tbl>
+      <w:tblPr>
+        <w:tblW w:type="dxa" w:w="9026"/>
+        <w:tblBorders>
+          <w:top w:val="single" w:color="auto" w:sz="4"/>
+          <w:left w:val="single" w:color="auto" w:sz="4"/>
+          <w:bottom w:val="single" w:color="auto" w:sz="4"/>
+          <w:right w:val="single" w:color="auto" w:sz="4"/>
+          <w:insideH w:val="single" w:color="auto" w:sz="4"/>
+          <w:insideV w:val="single" w:color="auto" w:sz="4"/>
+        </w:tblBorders>
+      </w:tblPr>
+      <w:tblGrid>
+        <w:gridCol w:w="3008"/>
+        <w:gridCol w:w="3008"/>
+        <w:gridCol w:w="3010"/>
+      </w:tblGrid>
+      <w:tr>
+        <w:trPr>
+          <w:tblHeader/>
+        </w:trPr>
+        <w:tc>
+          <w:tcPr>
+            <w:tcW w:type="dxa" w:w="3008"/>
+            <w:tcBorders>
+              <w:top w:val="single" w:color="BFBFBF" w:sz="1"/>
+              <w:left w:val="single" w:color="BFBFBF" w:sz="1"/>
+              <w:bottom w:val="single" w:color="BFBFBF" w:sz="1"/>
+              <w:right w:val="single" w:color="BFBFBF" w:sz="1"/>
+            </w:tcBorders>
+            <w:shd w:fill="D9E7F5" w:val="clear"/>
+            <w:tcMar>
+              <w:top w:type="dxa" w:w="50"/>
+              <w:left w:type="dxa" w:w="100"/>
+              <w:bottom w:type="dxa" w:w="50"/>
+              <w:right w:type="dxa" w:w="100"/>
+            </w:tcMar>
+          </w:tcPr>
+          <w:p>
+            <w:pPr>
+              <w:spacing w:after="0"/>
+            </w:pPr>
+            <w:r>
+              <w:rPr>
+                <w:b/>
+                <w:bCs/>
+              </w:rPr>
+              <w:t xml:space="preserve">Acteur</w:t>
+            </w:r>
+          </w:p>
+        </w:tc>
+        <w:tc>
+          <w:tcPr>
+            <w:tcW w:type="dxa" w:w="3008"/>
+            <w:tcBorders>
+              <w:top w:val="single" w:color="BFBFBF" w:sz="1"/>
+              <w:left w:val="single" w:color="BFBFBF" w:sz="1"/>
+              <w:bottom w:val="single" w:color="BFBFBF" w:sz="1"/>
+              <w:right w:val="single" w:color="BFBFBF" w:sz="1"/>
+            </w:tcBorders>
+            <w:shd w:fill="D9E7F5" w:val="clear"/>
+            <w:tcMar>
+              <w:top w:type="dxa" w:w="50"/>
+              <w:left w:type="dxa" w:w="100"/>
+              <w:bottom w:type="dxa" w:w="50"/>
+              <w:right w:type="dxa" w:w="100"/>
+            </w:tcMar>
+          </w:tcPr>
+          <w:p>
+            <w:pPr>
+              <w:spacing w:after="0"/>
+            </w:pPr>
+            <w:r>
+              <w:rPr>
+                <w:b/>
+                <w:bCs/>
+              </w:rPr>
+              <w:t xml:space="preserve">Utilise Jira ?</w:t>
+            </w:r>
+          </w:p>
+        </w:tc>
+        <w:tc>
+          <w:tcPr>
+            <w:tcW w:type="dxa" w:w="3010"/>
+            <w:tcBorders>
+              <w:top w:val="single" w:color="BFBFBF" w:sz="1"/>
+              <w:left w:val="single" w:color="BFBFBF" w:sz="1"/>
+              <w:bottom w:val="single" w:color="BFBFBF" w:sz="1"/>
+              <w:right w:val="single" w:color="BFBFBF" w:sz="1"/>
+            </w:tcBorders>
+            <w:shd w:fill="D9E7F5" w:val="clear"/>
+            <w:tcMar>
+              <w:top w:type="dxa" w:w="50"/>
+              <w:left w:type="dxa" w:w="100"/>
+              <w:bottom w:type="dxa" w:w="50"/>
+              <w:right w:type="dxa" w:w="100"/>
+            </w:tcMar>
+          </w:tcPr>
+          <w:p>
+            <w:pPr>
+              <w:spacing w:after="0"/>
+            </w:pPr>
+            <w:r>
+              <w:rPr>
+                <w:b/>
+                <w:bCs/>
+              </w:rPr>
+              <w:t xml:space="preserve">Rôle</w:t>
+            </w:r>
+          </w:p>
+        </w:tc>
+      </w:tr>
+      <w:tr>
+        <w:trPr>
+          <w:tblHeader w:val="false"/>
+        </w:trPr>
+        <w:tc>
+          <w:tcPr>
+            <w:tcW w:type="dxa" w:w="3008"/>
+            <w:tcBorders>
+              <w:top w:val="single" w:color="BFBFBF" w:sz="1"/>
+              <w:left w:val="single" w:color="BFBFBF" w:sz="1"/>
+              <w:bottom w:val="single" w:color="BFBFBF" w:sz="1"/>
+              <w:right w:val="single" w:color="BFBFBF" w:sz="1"/>
+            </w:tcBorders>
+            <w:tcMar>
+              <w:top w:type="dxa" w:w="50"/>
+              <w:left w:type="dxa" w:w="100"/>
+              <w:bottom w:type="dxa" w:w="50"/>
+              <w:right w:type="dxa" w:w="100"/>
+            </w:tcMar>
+          </w:tcPr>
+          <w:p>
+            <w:pPr>
+              <w:spacing w:after="0"/>
+            </w:pPr>
+            <w:r>
+              <w:rPr>
+                <w:b/>
+                <w:bCs/>
+              </w:rPr>
+              <w:t xml:space="preserve">Utilisateurs de l'application</w:t>
+            </w:r>
+            <w:r>
+              <w:t xml:space="preserve"> (grand public)</w:t>
+            </w:r>
+          </w:p>
+        </w:tc>
+        <w:tc>
+          <w:tcPr>
+            <w:tcW w:type="dxa" w:w="3008"/>
+            <w:tcBorders>
+              <w:top w:val="single" w:color="BFBFBF" w:sz="1"/>
+              <w:left w:val="single" w:color="BFBFBF" w:sz="1"/>
+              <w:bottom w:val="single" w:color="BFBFBF" w:sz="1"/>
+              <w:right w:val="single" w:color="BFBFBF" w:sz="1"/>
+            </w:tcBorders>
+            <w:tcMar>
+              <w:top w:type="dxa" w:w="50"/>
+              <w:left w:type="dxa" w:w="100"/>
+              <w:bottom w:type="dxa" w:w="50"/>
+              <w:right w:type="dxa" w:w="100"/>
+            </w:tcMar>
+          </w:tcPr>
+          <w:p>
+            <w:pPr>
+              <w:spacing w:after="0"/>
+            </w:pPr>
+            <w:r>
+              <w:t xml:space="preserve">Non</w:t>
+            </w:r>
+          </w:p>
+        </w:tc>
+        <w:tc>
+          <w:tcPr>
+            <w:tcW w:type="dxa" w:w="3010"/>
+            <w:tcBorders>
+              <w:top w:val="single" w:color="BFBFBF" w:sz="1"/>
+              <w:left w:val="single" w:color="BFBFBF" w:sz="1"/>
+              <w:bottom w:val="single" w:color="BFBFBF" w:sz="1"/>
+              <w:right w:val="single" w:color="BFBFBF" w:sz="1"/>
+            </w:tcBorders>
+            <w:tcMar>
+              <w:top w:type="dxa" w:w="50"/>
+              <w:left w:type="dxa" w:w="100"/>
+              <w:bottom w:type="dxa" w:w="50"/>
+              <w:right w:type="dxa" w:w="100"/>
+            </w:tcMar>
+          </w:tcPr>
+          <w:p>
+            <w:pPr>
+              <w:spacing w:after="0"/>
+            </w:pPr>
+            <w:r>
+              <w:t xml:space="preserve">Utilisent uniquement CalmSpace. En cas de bug, ils le signalent via un </w:t>
+            </w:r>
+            <w:r>
+              <w:rPr>
+                <w:b/>
+                <w:bCs/>
+              </w:rPr>
+              <w:t xml:space="preserve">formulaire de contact / support</w:t>
+            </w:r>
+            <w:r>
+              <w:t xml:space="preserve">.</w:t>
+            </w:r>
+          </w:p>
+        </w:tc>
+      </w:tr>
+      <w:tr>
+        <w:trPr>
+          <w:tblHeader w:val="false"/>
+        </w:trPr>
+        <w:tc>
+          <w:tcPr>
+            <w:tcW w:type="dxa" w:w="3008"/>
+            <w:tcBorders>
+              <w:top w:val="single" w:color="BFBFBF" w:sz="1"/>
+              <w:left w:val="single" w:color="BFBFBF" w:sz="1"/>
+              <w:bottom w:val="single" w:color="BFBFBF" w:sz="1"/>
+              <w:right w:val="single" w:color="BFBFBF" w:sz="1"/>
+            </w:tcBorders>
+            <w:tcMar>
+              <w:top w:type="dxa" w:w="50"/>
+              <w:left w:type="dxa" w:w="100"/>
+              <w:bottom w:type="dxa" w:w="50"/>
+              <w:right w:type="dxa" w:w="100"/>
+            </w:tcMar>
+          </w:tcPr>
+          <w:p>
+            <w:pPr>
+              <w:spacing w:after="0"/>
+            </w:pPr>
+            <w:r>
+              <w:rPr>
+                <w:b/>
+                <w:bCs/>
+              </w:rPr>
+              <w:t xml:space="preserve">Client (le Ministère)</w:t>
+            </w:r>
+          </w:p>
+        </w:tc>
+        <w:tc>
+          <w:tcPr>
+            <w:tcW w:type="dxa" w:w="3008"/>
+            <w:tcBorders>
+              <w:top w:val="single" w:color="BFBFBF" w:sz="1"/>
+              <w:left w:val="single" w:color="BFBFBF" w:sz="1"/>
+              <w:bottom w:val="single" w:color="BFBFBF" w:sz="1"/>
+              <w:right w:val="single" w:color="BFBFBF" w:sz="1"/>
+            </w:tcBorders>
+            <w:tcMar>
+              <w:top w:type="dxa" w:w="50"/>
+              <w:left w:type="dxa" w:w="100"/>
+              <w:bottom w:type="dxa" w:w="50"/>
+              <w:right w:type="dxa" w:w="100"/>
+            </w:tcMar>
+          </w:tcPr>
+          <w:p>
+            <w:pPr>
+              <w:spacing w:after="0"/>
+            </w:pPr>
+            <w:r>
+              <w:t xml:space="preserve">Oui</w:t>
+            </w:r>
+          </w:p>
+        </w:tc>
+        <w:tc>
+          <w:tcPr>
+            <w:tcW w:type="dxa" w:w="3010"/>
+            <w:tcBorders>
+              <w:top w:val="single" w:color="BFBFBF" w:sz="1"/>
+              <w:left w:val="single" w:color="BFBFBF" w:sz="1"/>
+              <w:bottom w:val="single" w:color="BFBFBF" w:sz="1"/>
+              <w:right w:val="single" w:color="BFBFBF" w:sz="1"/>
+            </w:tcBorders>
+            <w:tcMar>
+              <w:top w:type="dxa" w:w="50"/>
+              <w:left w:type="dxa" w:w="100"/>
+              <w:bottom w:type="dxa" w:w="50"/>
+              <w:right w:type="dxa" w:w="100"/>
+            </w:tcMar>
+          </w:tcPr>
+          <w:p>
+            <w:pPr>
+              <w:spacing w:after="0"/>
+            </w:pPr>
+            <w:r>
+              <w:rPr>
+                <w:b/>
+                <w:bCs/>
+              </w:rPr>
+              <w:t xml:space="preserve">Déclare les incidents</w:t>
+            </w:r>
+            <w:r>
+              <w:t xml:space="preserve"> et </w:t>
+            </w:r>
+            <w:r>
+              <w:rPr>
+                <w:b/>
+                <w:bCs/>
+              </w:rPr>
+              <w:t xml:space="preserve">demande les évolutions</w:t>
+            </w:r>
+            <w:r>
+              <w:t xml:space="preserve"> (via un référent), puis </w:t>
+            </w:r>
+            <w:r>
+              <w:rPr>
+                <w:b/>
+                <w:bCs/>
+              </w:rPr>
+              <w:t xml:space="preserve">valide</w:t>
+            </w:r>
+            <w:r>
+              <w:t xml:space="preserve"> les corrections livrées.</w:t>
+            </w:r>
+          </w:p>
+        </w:tc>
+      </w:tr>
+      <w:tr>
+        <w:trPr>
+          <w:tblHeader w:val="false"/>
+        </w:trPr>
+        <w:tc>
+          <w:tcPr>
+            <w:tcW w:type="dxa" w:w="3008"/>
+            <w:tcBorders>
+              <w:top w:val="single" w:color="BFBFBF" w:sz="1"/>
+              <w:left w:val="single" w:color="BFBFBF" w:sz="1"/>
+              <w:bottom w:val="single" w:color="BFBFBF" w:sz="1"/>
+              <w:right w:val="single" w:color="BFBFBF" w:sz="1"/>
+            </w:tcBorders>
+            <w:tcMar>
+              <w:top w:type="dxa" w:w="50"/>
+              <w:left w:type="dxa" w:w="100"/>
+              <w:bottom w:type="dxa" w:w="50"/>
+              <w:right w:type="dxa" w:w="100"/>
+            </w:tcMar>
+          </w:tcPr>
+          <w:p>
+            <w:pPr>
+              <w:spacing w:after="0"/>
+            </w:pPr>
+            <w:r>
+              <w:rPr>
+                <w:b/>
+                <w:bCs/>
+              </w:rPr>
+              <w:t xml:space="preserve">Prestataire (équipe de développement)</w:t>
+            </w:r>
+          </w:p>
+        </w:tc>
+        <w:tc>
+          <w:tcPr>
+            <w:tcW w:type="dxa" w:w="3008"/>
+            <w:tcBorders>
+              <w:top w:val="single" w:color="BFBFBF" w:sz="1"/>
+              <w:left w:val="single" w:color="BFBFBF" w:sz="1"/>
+              <w:bottom w:val="single" w:color="BFBFBF" w:sz="1"/>
+              <w:right w:val="single" w:color="BFBFBF" w:sz="1"/>
+            </w:tcBorders>
+            <w:tcMar>
+              <w:top w:type="dxa" w:w="50"/>
+              <w:left w:type="dxa" w:w="100"/>
+              <w:bottom w:type="dxa" w:w="50"/>
+              <w:right w:type="dxa" w:w="100"/>
+            </w:tcMar>
+          </w:tcPr>
+          <w:p>
+            <w:pPr>
+              <w:spacing w:after="0"/>
+            </w:pPr>
+            <w:r>
+              <w:t xml:space="preserve">Oui</w:t>
+            </w:r>
+          </w:p>
+        </w:tc>
+        <w:tc>
+          <w:tcPr>
+            <w:tcW w:type="dxa" w:w="3010"/>
+            <w:tcBorders>
+              <w:top w:val="single" w:color="BFBFBF" w:sz="1"/>
+              <w:left w:val="single" w:color="BFBFBF" w:sz="1"/>
+              <w:bottom w:val="single" w:color="BFBFBF" w:sz="1"/>
+              <w:right w:val="single" w:color="BFBFBF" w:sz="1"/>
+            </w:tcBorders>
+            <w:tcMar>
+              <w:top w:type="dxa" w:w="50"/>
+              <w:left w:type="dxa" w:w="100"/>
+              <w:bottom w:type="dxa" w:w="50"/>
+              <w:right w:type="dxa" w:w="100"/>
+            </w:tcMar>
+          </w:tcPr>
+          <w:p>
+            <w:pPr>
+              <w:spacing w:after="0"/>
+            </w:pPr>
+            <w:r>
+              <w:rPr>
+                <w:b/>
+                <w:bCs/>
+              </w:rPr>
+              <w:t xml:space="preserve">Reçoit, qualifie, traite</w:t>
+            </w:r>
+            <w:r>
+              <w:t xml:space="preserve"> les tickets, met à jour leur statut et les </w:t>
+            </w:r>
+            <w:r>
+              <w:rPr>
+                <w:b/>
+                <w:bCs/>
+              </w:rPr>
+              <w:t xml:space="preserve">clôture</w:t>
+            </w:r>
+            <w:r>
+              <w:t xml:space="preserve">. Crée aussi des tickets internes (tâches techniques, veille, bugs détectés par la supervision).</w:t>
+            </w:r>
+          </w:p>
+        </w:tc>
+      </w:tr>
+    </w:tbl>
+    <w:p>
+      <w:pPr>
+        <w:spacing w:after="80"/>
+      </w:pPr>
+    </w:p>
+    <w:p>
+      <w:r>
+        <w:t xml:space="preserve">Parcours d'un problème signalé par un utilisateur final :</w:t>
+      </w:r>
+    </w:p>
+    <w:p>
+      <w:pPr>
+        <w:spacing w:after="0"/>
+      </w:pPr>
+      <w:r>
+        <w:rPr>
+          <w:rFonts w:ascii="Consolas" w:cs="Consolas" w:eastAsia="Consolas" w:hAnsi="Consolas"/>
+          <w:sz w:val="16"/>
+          <w:szCs w:val="16"/>
+        </w:rPr>
+        <w:t xml:space="preserve">Utilisateur (voit un bug)</w:t>
+      </w:r>
+    </w:p>
+    <w:p>
+      <w:pPr>
+        <w:spacing w:after="0"/>
+      </w:pPr>
+      <w:r>
+        <w:rPr>
+          <w:rFonts w:ascii="Consolas" w:cs="Consolas" w:eastAsia="Consolas" w:hAnsi="Consolas"/>
+          <w:sz w:val="16"/>
+          <w:szCs w:val="16"/>
+        </w:rPr>
+        <w:t xml:space="preserve">      │ signale via le formulaire de contact / support</w:t>
+      </w:r>
+    </w:p>
+    <w:p>
+      <w:pPr>
+        <w:spacing w:after="0"/>
+      </w:pPr>
+      <w:r>
+        <w:rPr>
+          <w:rFonts w:ascii="Consolas" w:cs="Consolas" w:eastAsia="Consolas" w:hAnsi="Consolas"/>
+          <w:sz w:val="16"/>
+          <w:szCs w:val="16"/>
+        </w:rPr>
+        <w:t xml:space="preserve">      ▼</w:t>
+      </w:r>
+    </w:p>
+    <w:p>
+      <w:pPr>
+        <w:spacing w:after="0"/>
+      </w:pPr>
+      <w:r>
+        <w:rPr>
+          <w:rFonts w:ascii="Consolas" w:cs="Consolas" w:eastAsia="Consolas" w:hAnsi="Consolas"/>
+          <w:sz w:val="16"/>
+          <w:szCs w:val="16"/>
+        </w:rPr>
+        <w:t xml:space="preserve">Référent du Ministère (client) ──► crée un ticket Jira</w:t>
+      </w:r>
+    </w:p>
+    <w:p>
+      <w:pPr>
+        <w:spacing w:after="0"/>
+      </w:pPr>
+      <w:r>
+        <w:rPr>
+          <w:rFonts w:ascii="Consolas" w:cs="Consolas" w:eastAsia="Consolas" w:hAnsi="Consolas"/>
+          <w:sz w:val="16"/>
+          <w:szCs w:val="16"/>
+        </w:rPr>
+        <w:t xml:space="preserve">      │</w:t>
+      </w:r>
+    </w:p>
+    <w:p>
+      <w:pPr>
+        <w:spacing w:after="0"/>
+      </w:pPr>
+      <w:r>
+        <w:rPr>
+          <w:rFonts w:ascii="Consolas" w:cs="Consolas" w:eastAsia="Consolas" w:hAnsi="Consolas"/>
+          <w:sz w:val="16"/>
+          <w:szCs w:val="16"/>
+        </w:rPr>
+        <w:t xml:space="preserve">      ▼</w:t>
+      </w:r>
+    </w:p>
+    <w:p>
+      <w:pPr>
+        <w:spacing w:after="0"/>
+      </w:pPr>
+      <w:r>
+        <w:rPr>
+          <w:rFonts w:ascii="Consolas" w:cs="Consolas" w:eastAsia="Consolas" w:hAnsi="Consolas"/>
+          <w:sz w:val="16"/>
+          <w:szCs w:val="16"/>
+        </w:rPr>
+        <w:t xml:space="preserve">Prestataire (dev) ──► prend en charge, corrige, passe « En recette »</w:t>
+      </w:r>
+    </w:p>
+    <w:p>
+      <w:pPr>
+        <w:spacing w:after="0"/>
+      </w:pPr>
+      <w:r>
+        <w:rPr>
+          <w:rFonts w:ascii="Consolas" w:cs="Consolas" w:eastAsia="Consolas" w:hAnsi="Consolas"/>
+          <w:sz w:val="16"/>
+          <w:szCs w:val="16"/>
+        </w:rPr>
+        <w:t xml:space="preserve">      │</w:t>
+      </w:r>
+    </w:p>
+    <w:p>
+      <w:pPr>
+        <w:spacing w:after="0"/>
+      </w:pPr>
+      <w:r>
+        <w:rPr>
+          <w:rFonts w:ascii="Consolas" w:cs="Consolas" w:eastAsia="Consolas" w:hAnsi="Consolas"/>
+          <w:sz w:val="16"/>
+          <w:szCs w:val="16"/>
+        </w:rPr>
+        <w:t xml:space="preserve">      ▼</w:t>
+      </w:r>
+    </w:p>
+    <w:p>
+      <w:pPr>
+        <w:spacing w:after="0"/>
+      </w:pPr>
+      <w:r>
+        <w:rPr>
+          <w:rFonts w:ascii="Consolas" w:cs="Consolas" w:eastAsia="Consolas" w:hAnsi="Consolas"/>
+          <w:sz w:val="16"/>
+          <w:szCs w:val="16"/>
+        </w:rPr>
+        <w:t xml:space="preserve">Client ──► valide ──► ticket clôturé</w:t>
+      </w:r>
+    </w:p>
+    <w:p>
+      <w:pPr>
+        <w:spacing w:after="80"/>
+      </w:pPr>
     </w:p>
     <w:p>
       <w:pPr>

</xml_diff>